<commit_message>
Corrige la franja del programador: viernes 2-5 pm, 7 sesiones
El docente confirma la franja real: viernes de 2:00 a 5:00 p. m. a partir
del 21 de agosto (no sábados). Son 7 sesiones, los mismos viernes del
Seminario pero en la tarde: 21 ago, 4 sep, 18 sep, 2 oct, 16 oct, 30 oct,
20 nov (semanas 4/6/8/10/12/14/17). Sin el 8 de agosto.

- Modalidad verificada contra HORARIOS 2026-II: 4 presenciales (21 ago,
  18 sep, 16 oct, 20 nov) y 3 sincrónicas (4 sep, 2 oct, 30 oct).
- Seis unidades en una sesión cada una + integrador; U1 comprimida con la
  presentación. Bloques 2-3, 3-4, 4-5 pm. 22 renglones (7 sesiones x 3 +
  fila institucional del 13 nov, tesis II).
- 48 h presenciales declaradas vs 21 reales (7 x 3), como en el Seminario.
- Regenerado docs/Programador_2026-II.docx; actualizados generar-programador.py,
  docs/PROGRAMADOR-2026-II.md y docs/calendario.md.

Co-Authored-By: Claude Opus 4.8 (1M context) <noreply@anthropic.com>
</commit_message>
<xml_diff>
--- a/docs/Programador_2026-II.docx
+++ b/docs/Programador_2026-II.docx
@@ -1274,7 +1274,7 @@
             </w:pPr>
             <w:r>
               <w:rPr/>
-              <w:t>2</w:t>
+              <w:t>4</w:t>
             </w:r>
           </w:p>
         </w:tc>
@@ -1308,7 +1308,7 @@
             </w:pPr>
             <w:r>
               <w:rPr/>
-              <w:t>08/08/2026</w:t>
+              <w:t>21/08/2026</w:t>
             </w:r>
           </w:p>
           <w:p>
@@ -1336,7 +1336,7 @@
             </w:pPr>
             <w:r>
               <w:rPr/>
-              <w:t>8:00-9:00 am</w:t>
+              <w:t>2:00-3:00 pm</w:t>
             </w:r>
           </w:p>
         </w:tc>
@@ -1375,7 +1375,7 @@
                 <w:b/>
                 <w:sz w:val="20"/>
               </w:rPr>
-              <w:t>Encuentro sincrónico</w:t>
+              <w:t>Encuentro presencial</w:t>
             </w:r>
           </w:p>
           <w:p>
@@ -1471,7 +1471,7 @@
                 <w:b/>
                 <w:sz w:val="20"/>
               </w:rPr>
-              <w:t>Tema 1. Declinación funcional y trayectorias de enfermedad en cuidados paliativos</w:t>
+              <w:t>Tema 1. Declinación funcional, trayectorias de enfermedad y concepto de rehabilitación paliativa</w:t>
             </w:r>
           </w:p>
         </w:tc>
@@ -1555,22 +1555,22 @@
             </w:pPr>
             <w:r>
               <w:rPr/>
-              <w:t>08/08/2026</w:t>
-            </w:r>
-          </w:p>
-          <w:p>
-            <w:pPr>
-              <w:spacing w:after="0" w:line="240" w:lineRule="auto"/>
-              <w:jc w:val="center"/>
-              <w:rPr>
-                <w:rFonts w:ascii="Verdana" w:cs="Verdana" w:eastAsia="Verdana" w:hAnsi="Verdana"/>
-                <w:sz w:val="20"/>
-                <w:szCs w:val="20"/>
-              </w:rPr>
-            </w:pPr>
-            <w:r>
-              <w:rPr/>
-              <w:t>9:00-10:00 am</w:t>
+              <w:t>21/08/2026</w:t>
+            </w:r>
+          </w:p>
+          <w:p>
+            <w:pPr>
+              <w:spacing w:after="0" w:line="240" w:lineRule="auto"/>
+              <w:jc w:val="center"/>
+              <w:rPr>
+                <w:rFonts w:ascii="Verdana" w:cs="Verdana" w:eastAsia="Verdana" w:hAnsi="Verdana"/>
+                <w:sz w:val="20"/>
+                <w:szCs w:val="20"/>
+              </w:rPr>
+            </w:pPr>
+            <w:r>
+              <w:rPr/>
+              <w:t>3:00-4:00 pm</w:t>
             </w:r>
           </w:p>
         </w:tc>
@@ -1598,7 +1598,7 @@
                 <w:b/>
                 <w:sz w:val="20"/>
               </w:rPr>
-              <w:t>Tema 1. Concepto de rehabilitación (OMS) y de rehabilitación paliativa (Tiberini y Richardson)</w:t>
+              <w:t>Tema 2. Modelos de intervenciones en rehabilitación paliativa</w:t>
             </w:r>
           </w:p>
         </w:tc>
@@ -1687,26 +1687,26 @@
             </w:pPr>
             <w:r>
               <w:rPr/>
-              <w:t>08/08/2026</w:t>
-            </w:r>
-          </w:p>
-          <w:p>
-            <w:pPr>
-              <w:tabs>
-                <w:tab w:val="left" w:leader="none" w:pos="4809"/>
-                <w:tab w:val="left" w:leader="none" w:pos="10009"/>
-              </w:tabs>
-              <w:spacing w:after="0" w:line="240" w:lineRule="auto"/>
-              <w:jc w:val="center"/>
-              <w:rPr>
-                <w:rFonts w:ascii="Verdana" w:cs="Verdana" w:eastAsia="Verdana" w:hAnsi="Verdana"/>
-                <w:sz w:val="20"/>
-                <w:szCs w:val="20"/>
-              </w:rPr>
-            </w:pPr>
-            <w:r>
-              <w:rPr/>
-              <w:t>10:00-11:00 am</w:t>
+              <w:t>21/08/2026</w:t>
+            </w:r>
+          </w:p>
+          <w:p>
+            <w:pPr>
+              <w:tabs>
+                <w:tab w:val="left" w:leader="none" w:pos="4809"/>
+                <w:tab w:val="left" w:leader="none" w:pos="10009"/>
+              </w:tabs>
+              <w:spacing w:after="0" w:line="240" w:lineRule="auto"/>
+              <w:jc w:val="center"/>
+              <w:rPr>
+                <w:rFonts w:ascii="Verdana" w:cs="Verdana" w:eastAsia="Verdana" w:hAnsi="Verdana"/>
+                <w:sz w:val="20"/>
+                <w:szCs w:val="20"/>
+              </w:rPr>
+            </w:pPr>
+            <w:r>
+              <w:rPr/>
+              <w:t>4:00-5:00 pm</w:t>
             </w:r>
           </w:p>
         </w:tc>
@@ -1734,7 +1734,7 @@
                 <w:b/>
                 <w:sz w:val="20"/>
               </w:rPr>
-              <w:t>Tema 1. Trayectorias clínicas de enfermedad y ventanas de intervención rehabilitadora</w:t>
+              <w:t>Tema 3. Realidad virtual, tecnología móvil, aplicaciones en salud, objetos virtuales de aprendizaje e inteligencia artificial generativa (Wysa)</w:t>
             </w:r>
           </w:p>
         </w:tc>
@@ -1797,51 +1797,51 @@
             </w:pPr>
             <w:r>
               <w:rPr/>
-              <w:t>4</w:t>
-            </w:r>
-          </w:p>
-        </w:tc>
-        <w:tc>
-          <w:tcPr>
-            <w:shd w:fill="ffffff" w:val="clear"/>
-            <w:vAlign w:val="center"/>
-          </w:tcPr>
-          <w:p>
-            <w:pPr>
-              <w:tabs>
-                <w:tab w:val="left" w:leader="none" w:pos="4809"/>
-                <w:tab w:val="left" w:leader="none" w:pos="10009"/>
-              </w:tabs>
-              <w:spacing w:after="0" w:line="240" w:lineRule="auto"/>
-              <w:jc w:val="center"/>
-              <w:rPr>
-                <w:rFonts w:ascii="Verdana" w:cs="Verdana" w:eastAsia="Verdana" w:hAnsi="Verdana"/>
-                <w:sz w:val="20"/>
-                <w:szCs w:val="20"/>
-              </w:rPr>
-            </w:pPr>
-            <w:r>
-              <w:rPr/>
-              <w:t>22/08/2026</w:t>
-            </w:r>
-          </w:p>
-          <w:p>
-            <w:pPr>
-              <w:tabs>
-                <w:tab w:val="left" w:leader="none" w:pos="4809"/>
-                <w:tab w:val="left" w:leader="none" w:pos="10009"/>
-              </w:tabs>
-              <w:spacing w:after="0" w:line="240" w:lineRule="auto"/>
-              <w:jc w:val="center"/>
-              <w:rPr>
-                <w:rFonts w:ascii="Verdana" w:cs="Verdana" w:eastAsia="Verdana" w:hAnsi="Verdana"/>
-                <w:sz w:val="20"/>
-                <w:szCs w:val="20"/>
-              </w:rPr>
-            </w:pPr>
-            <w:r>
-              <w:rPr/>
-              <w:t>8:00-9:00 am</w:t>
+              <w:t>6</w:t>
+            </w:r>
+          </w:p>
+        </w:tc>
+        <w:tc>
+          <w:tcPr>
+            <w:shd w:fill="ffffff" w:val="clear"/>
+            <w:vAlign w:val="center"/>
+          </w:tcPr>
+          <w:p>
+            <w:pPr>
+              <w:tabs>
+                <w:tab w:val="left" w:leader="none" w:pos="4809"/>
+                <w:tab w:val="left" w:leader="none" w:pos="10009"/>
+              </w:tabs>
+              <w:spacing w:after="0" w:line="240" w:lineRule="auto"/>
+              <w:jc w:val="center"/>
+              <w:rPr>
+                <w:rFonts w:ascii="Verdana" w:cs="Verdana" w:eastAsia="Verdana" w:hAnsi="Verdana"/>
+                <w:sz w:val="20"/>
+                <w:szCs w:val="20"/>
+              </w:rPr>
+            </w:pPr>
+            <w:r>
+              <w:rPr/>
+              <w:t>04/09/2026</w:t>
+            </w:r>
+          </w:p>
+          <w:p>
+            <w:pPr>
+              <w:tabs>
+                <w:tab w:val="left" w:leader="none" w:pos="4809"/>
+                <w:tab w:val="left" w:leader="none" w:pos="10009"/>
+              </w:tabs>
+              <w:spacing w:after="0" w:line="240" w:lineRule="auto"/>
+              <w:jc w:val="center"/>
+              <w:rPr>
+                <w:rFonts w:ascii="Verdana" w:cs="Verdana" w:eastAsia="Verdana" w:hAnsi="Verdana"/>
+                <w:sz w:val="20"/>
+                <w:szCs w:val="20"/>
+              </w:rPr>
+            </w:pPr>
+            <w:r>
+              <w:rPr/>
+              <w:t>2:00-3:00 pm</w:t>
             </w:r>
           </w:p>
         </w:tc>
@@ -1869,7 +1869,7 @@
                 <w:b/>
                 <w:sz w:val="20"/>
               </w:rPr>
-              <w:t>Encuentro presencial</w:t>
+              <w:t>Encuentro sincrónico</w:t>
             </w:r>
           </w:p>
           <w:p>
@@ -1890,7 +1890,28 @@
                 <w:b/>
                 <w:sz w:val="20"/>
               </w:rPr>
-              <w:t>Tema 2. Modelos de intervenciones en rehabilitación paliativa</w:t>
+              <w:t>Unidad 2. Abordajes de investigaciones en rehabilitación paliativa en cáncer</w:t>
+            </w:r>
+          </w:p>
+          <w:p>
+            <w:pPr>
+              <w:spacing w:after="0" w:line="240" w:lineRule="auto"/>
+              <w:jc w:val="center"/>
+              <w:rPr>
+                <w:rFonts w:ascii="Verdana" w:cs="Verdana" w:eastAsia="Verdana" w:hAnsi="Verdana"/>
+                <w:b w:val="1"/>
+                <w:bCs w:val="1"/>
+                <w:sz w:val="20"/>
+                <w:szCs w:val="20"/>
+              </w:rPr>
+            </w:pPr>
+            <w:r>
+              <w:rPr>
+                <w:rFonts w:ascii="Verdana" w:hAnsi="Verdana"/>
+                <w:b/>
+                <w:sz w:val="20"/>
+              </w:rPr>
+              <w:t>Tema 1. Rehabilitación física y psicosocial: dolor, complicaciones neuromusculares y musculoesqueléticas, edema y linfedema</w:t>
             </w:r>
           </w:p>
         </w:tc>
@@ -1974,22 +1995,22 @@
             </w:pPr>
             <w:r>
               <w:rPr/>
-              <w:t>22/08/2026</w:t>
-            </w:r>
-          </w:p>
-          <w:p>
-            <w:pPr>
-              <w:spacing w:after="0" w:line="240" w:lineRule="auto"/>
-              <w:jc w:val="center"/>
-              <w:rPr>
-                <w:rFonts w:ascii="Verdana" w:cs="Verdana" w:eastAsia="Verdana" w:hAnsi="Verdana"/>
-                <w:sz w:val="20"/>
-                <w:szCs w:val="20"/>
-              </w:rPr>
-            </w:pPr>
-            <w:r>
-              <w:rPr/>
-              <w:t>9:00-10:00 am</w:t>
+              <w:t>04/09/2026</w:t>
+            </w:r>
+          </w:p>
+          <w:p>
+            <w:pPr>
+              <w:spacing w:after="0" w:line="240" w:lineRule="auto"/>
+              <w:jc w:val="center"/>
+              <w:rPr>
+                <w:rFonts w:ascii="Verdana" w:cs="Verdana" w:eastAsia="Verdana" w:hAnsi="Verdana"/>
+                <w:sz w:val="20"/>
+                <w:szCs w:val="20"/>
+              </w:rPr>
+            </w:pPr>
+            <w:r>
+              <w:rPr/>
+              <w:t>3:00-4:00 pm</w:t>
             </w:r>
           </w:p>
         </w:tc>
@@ -2017,7 +2038,7 @@
                 <w:b/>
                 <w:sz w:val="20"/>
               </w:rPr>
-              <w:t>Tema 3. Realidad virtual durante la rehabilitación de personas que requieren cuidados paliativos</w:t>
+              <w:t>Tema 2. Ámbitos de rehabilitación: unidades paliativas y entornos hospitalarios, centros día, programas comunitarios y rehabilitación infantil</w:t>
             </w:r>
           </w:p>
         </w:tc>
@@ -2100,22 +2121,22 @@
             </w:pPr>
             <w:r>
               <w:rPr/>
-              <w:t>22/08/2026</w:t>
-            </w:r>
-          </w:p>
-          <w:p>
-            <w:pPr>
-              <w:spacing w:after="0" w:line="240" w:lineRule="auto"/>
-              <w:jc w:val="center"/>
-              <w:rPr>
-                <w:rFonts w:ascii="Verdana" w:cs="Verdana" w:eastAsia="Verdana" w:hAnsi="Verdana"/>
-                <w:sz w:val="20"/>
-                <w:szCs w:val="20"/>
-              </w:rPr>
-            </w:pPr>
-            <w:r>
-              <w:rPr/>
-              <w:t>10:00-11:00 am</w:t>
+              <w:t>04/09/2026</w:t>
+            </w:r>
+          </w:p>
+          <w:p>
+            <w:pPr>
+              <w:spacing w:after="0" w:line="240" w:lineRule="auto"/>
+              <w:jc w:val="center"/>
+              <w:rPr>
+                <w:rFonts w:ascii="Verdana" w:cs="Verdana" w:eastAsia="Verdana" w:hAnsi="Verdana"/>
+                <w:sz w:val="20"/>
+                <w:szCs w:val="20"/>
+              </w:rPr>
+            </w:pPr>
+            <w:r>
+              <w:rPr/>
+              <w:t>4:00-5:00 pm</w:t>
             </w:r>
           </w:p>
         </w:tc>
@@ -2137,7 +2158,22 @@
             </w:pPr>
             <w:r>
               <w:rPr/>
-              <w:t>Tema 3. Tecnología móvil, aplicaciones en salud, objetos virtuales de aprendizaje e inteligencia artificial generativa (Wysa)</w:t>
+              <w:t>Tema 3. Medición de resultados funcionales</w:t>
+            </w:r>
+          </w:p>
+          <w:p>
+            <w:pPr>
+              <w:spacing w:after="0" w:line="240" w:lineRule="auto"/>
+              <w:jc w:val="both"/>
+              <w:rPr>
+                <w:rFonts w:ascii="Verdana" w:cs="Verdana" w:eastAsia="Verdana" w:hAnsi="Verdana"/>
+                <w:sz w:val="20"/>
+                <w:szCs w:val="20"/>
+              </w:rPr>
+            </w:pPr>
+            <w:r>
+              <w:rPr/>
+              <w:t>Entrega Primer Producto 35 %</w:t>
             </w:r>
           </w:p>
         </w:tc>
@@ -2200,43 +2236,43 @@
             </w:pPr>
             <w:r>
               <w:rPr/>
-              <w:t>6</w:t>
-            </w:r>
-          </w:p>
-        </w:tc>
-        <w:tc>
-          <w:tcPr>
-            <w:shd w:fill="ffffff" w:val="clear"/>
-            <w:vAlign w:val="center"/>
-          </w:tcPr>
-          <w:p>
-            <w:pPr>
-              <w:spacing w:after="0" w:line="240" w:lineRule="auto"/>
-              <w:jc w:val="center"/>
-              <w:rPr>
-                <w:rFonts w:ascii="Verdana" w:cs="Verdana" w:eastAsia="Verdana" w:hAnsi="Verdana"/>
-                <w:sz w:val="20"/>
-                <w:szCs w:val="20"/>
-              </w:rPr>
-            </w:pPr>
-            <w:r>
-              <w:rPr/>
-              <w:t>05/09/2026</w:t>
-            </w:r>
-          </w:p>
-          <w:p>
-            <w:pPr>
-              <w:spacing w:after="0" w:line="240" w:lineRule="auto"/>
-              <w:jc w:val="center"/>
-              <w:rPr>
-                <w:rFonts w:ascii="Verdana" w:cs="Verdana" w:eastAsia="Verdana" w:hAnsi="Verdana"/>
-                <w:sz w:val="20"/>
-                <w:szCs w:val="20"/>
-              </w:rPr>
-            </w:pPr>
-            <w:r>
-              <w:rPr/>
-              <w:t>8:00-9:00 am</w:t>
+              <w:t>8</w:t>
+            </w:r>
+          </w:p>
+        </w:tc>
+        <w:tc>
+          <w:tcPr>
+            <w:shd w:fill="ffffff" w:val="clear"/>
+            <w:vAlign w:val="center"/>
+          </w:tcPr>
+          <w:p>
+            <w:pPr>
+              <w:spacing w:after="0" w:line="240" w:lineRule="auto"/>
+              <w:jc w:val="center"/>
+              <w:rPr>
+                <w:rFonts w:ascii="Verdana" w:cs="Verdana" w:eastAsia="Verdana" w:hAnsi="Verdana"/>
+                <w:sz w:val="20"/>
+                <w:szCs w:val="20"/>
+              </w:rPr>
+            </w:pPr>
+            <w:r>
+              <w:rPr/>
+              <w:t>18/09/2026</w:t>
+            </w:r>
+          </w:p>
+          <w:p>
+            <w:pPr>
+              <w:spacing w:after="0" w:line="240" w:lineRule="auto"/>
+              <w:jc w:val="center"/>
+              <w:rPr>
+                <w:rFonts w:ascii="Verdana" w:cs="Verdana" w:eastAsia="Verdana" w:hAnsi="Verdana"/>
+                <w:sz w:val="20"/>
+                <w:szCs w:val="20"/>
+              </w:rPr>
+            </w:pPr>
+            <w:r>
+              <w:rPr/>
+              <w:t>2:00-3:00 pm</w:t>
             </w:r>
           </w:p>
         </w:tc>
@@ -2281,7 +2317,7 @@
             </w:pPr>
             <w:r>
               <w:rPr/>
-              <w:t>Encuentro sincrónico</w:t>
+              <w:t>Encuentro presencial</w:t>
             </w:r>
           </w:p>
           <w:p>
@@ -2319,7 +2355,7 @@
             </w:pPr>
             <w:r>
               <w:rPr/>
-              <w:t>Unidad 2. Abordajes de investigaciones en rehabilitación paliativa en cáncer</w:t>
+              <w:t>Unidad 3. Abordajes de investigaciones en rehabilitación paliativa en falla de órgano</w:t>
             </w:r>
           </w:p>
           <w:p>
@@ -2357,7 +2393,7 @@
             </w:pPr>
             <w:r>
               <w:rPr/>
-              <w:t>Tema 1. Rehabilitación física y psicosocial: dolor, complicaciones neuromusculares y musculoesqueléticas, edema y linfedema</w:t>
+              <w:t>Tema 1. Rehabilitación física, funcional y social: rehabilitación cardiovascular e indicaciones para el control de síntomas</w:t>
             </w:r>
           </w:p>
         </w:tc>
@@ -2441,22 +2477,22 @@
             </w:pPr>
             <w:r>
               <w:rPr/>
-              <w:t>05/09/2026</w:t>
-            </w:r>
-          </w:p>
-          <w:p>
-            <w:pPr>
-              <w:spacing w:after="0" w:line="240" w:lineRule="auto"/>
-              <w:jc w:val="center"/>
-              <w:rPr>
-                <w:rFonts w:ascii="Verdana" w:cs="Verdana" w:eastAsia="Verdana" w:hAnsi="Verdana"/>
-                <w:sz w:val="20"/>
-                <w:szCs w:val="20"/>
-              </w:rPr>
-            </w:pPr>
-            <w:r>
-              <w:rPr/>
-              <w:t>9:00-10:00 am</w:t>
+              <w:t>18/09/2026</w:t>
+            </w:r>
+          </w:p>
+          <w:p>
+            <w:pPr>
+              <w:spacing w:after="0" w:line="240" w:lineRule="auto"/>
+              <w:jc w:val="center"/>
+              <w:rPr>
+                <w:rFonts w:ascii="Verdana" w:cs="Verdana" w:eastAsia="Verdana" w:hAnsi="Verdana"/>
+                <w:sz w:val="20"/>
+                <w:szCs w:val="20"/>
+              </w:rPr>
+            </w:pPr>
+            <w:r>
+              <w:rPr/>
+              <w:t>3:00-4:00 pm</w:t>
             </w:r>
           </w:p>
         </w:tc>
@@ -2501,7 +2537,45 @@
             </w:pPr>
             <w:r>
               <w:rPr/>
-              <w:t>Tema 2. Ámbitos de rehabilitación: unidades paliativas y entornos hospitalarios, centros día, programas comunitarios y rehabilitación infantil</w:t>
+              <w:t>Tema 1. Manejo de la disfagia orofaríngea y trastornos de la deglución</w:t>
+            </w:r>
+          </w:p>
+          <w:p>
+            <w:pPr>
+              <w:keepNext w:val="0"/>
+              <w:keepLines w:val="0"/>
+              <w:pageBreakBefore w:val="0"/>
+              <w:widowControl w:val="1"/>
+              <w:pBdr>
+                <w:top w:space="0" w:sz="0" w:val="nil"/>
+                <w:left w:space="0" w:sz="0" w:val="nil"/>
+                <w:bottom w:space="0" w:sz="0" w:val="nil"/>
+                <w:right w:space="0" w:sz="0" w:val="nil"/>
+                <w:between w:space="0" w:sz="0" w:val="nil"/>
+              </w:pBdr>
+              <w:shd w:fill="auto" w:val="clear"/>
+              <w:spacing w:after="0" w:before="0" w:line="240" w:lineRule="auto"/>
+              <w:ind w:left="360" w:right="0" w:firstLine="0"/>
+              <w:jc w:val="both"/>
+              <w:rPr>
+                <w:rFonts w:ascii="Verdana" w:cs="Verdana" w:eastAsia="Verdana" w:hAnsi="Verdana"/>
+                <w:b w:val="0"/>
+                <w:bCs w:val="0"/>
+                <w:i w:val="0"/>
+                <w:iCs w:val="0"/>
+                <w:smallCaps w:val="0"/>
+                <w:strike w:val="0"/>
+                <w:color w:val="000000"/>
+                <w:sz w:val="20"/>
+                <w:szCs w:val="20"/>
+                <w:u w:val="none"/>
+                <w:shd w:fill="auto" w:val="clear"/>
+                <w:vertAlign w:val="baseline"/>
+              </w:rPr>
+            </w:pPr>
+            <w:r>
+              <w:rPr/>
+              <w:t>Tema 2. Ámbitos de rehabilitación (institucional, domiciliaria, comunitaria)</w:t>
             </w:r>
           </w:p>
         </w:tc>
@@ -2584,22 +2658,22 @@
             </w:pPr>
             <w:r>
               <w:rPr/>
-              <w:t>05/09/2026</w:t>
-            </w:r>
-          </w:p>
-          <w:p>
-            <w:pPr>
-              <w:spacing w:after="0" w:line="240" w:lineRule="auto"/>
-              <w:jc w:val="center"/>
-              <w:rPr>
-                <w:rFonts w:ascii="Verdana" w:cs="Verdana" w:eastAsia="Verdana" w:hAnsi="Verdana"/>
-                <w:sz w:val="20"/>
-                <w:szCs w:val="20"/>
-              </w:rPr>
-            </w:pPr>
-            <w:r>
-              <w:rPr/>
-              <w:t>10:00-11:00 am</w:t>
+              <w:t>18/09/2026</w:t>
+            </w:r>
+          </w:p>
+          <w:p>
+            <w:pPr>
+              <w:spacing w:after="0" w:line="240" w:lineRule="auto"/>
+              <w:jc w:val="center"/>
+              <w:rPr>
+                <w:rFonts w:ascii="Verdana" w:cs="Verdana" w:eastAsia="Verdana" w:hAnsi="Verdana"/>
+                <w:sz w:val="20"/>
+                <w:szCs w:val="20"/>
+              </w:rPr>
+            </w:pPr>
+            <w:r>
+              <w:rPr/>
+              <w:t>4:00-5:00 pm</w:t>
             </w:r>
           </w:p>
         </w:tc>
@@ -2621,22 +2695,22 @@
             </w:pPr>
             <w:r>
               <w:rPr/>
+              <w:t>Tema 2. Programas de rehabilitación cardiopulmonar y rehabilitación domiciliaria</w:t>
+            </w:r>
+          </w:p>
+          <w:p>
+            <w:pPr>
+              <w:spacing w:after="0" w:line="240" w:lineRule="auto"/>
+              <w:jc w:val="both"/>
+              <w:rPr>
+                <w:rFonts w:ascii="Verdana" w:cs="Verdana" w:eastAsia="Verdana" w:hAnsi="Verdana"/>
+                <w:sz w:val="20"/>
+                <w:szCs w:val="20"/>
+              </w:rPr>
+            </w:pPr>
+            <w:r>
+              <w:rPr/>
               <w:t>Tema 3. Medición de resultados funcionales</w:t>
-            </w:r>
-          </w:p>
-          <w:p>
-            <w:pPr>
-              <w:spacing w:after="0" w:line="240" w:lineRule="auto"/>
-              <w:jc w:val="both"/>
-              <w:rPr>
-                <w:rFonts w:ascii="Verdana" w:cs="Verdana" w:eastAsia="Verdana" w:hAnsi="Verdana"/>
-                <w:sz w:val="20"/>
-                <w:szCs w:val="20"/>
-              </w:rPr>
-            </w:pPr>
-            <w:r>
-              <w:rPr/>
-              <w:t>Entrega Primer Producto 35 %</w:t>
             </w:r>
           </w:p>
         </w:tc>
@@ -2699,43 +2773,43 @@
             </w:pPr>
             <w:r>
               <w:rPr/>
-              <w:t>8</w:t>
-            </w:r>
-          </w:p>
-        </w:tc>
-        <w:tc>
-          <w:tcPr>
-            <w:shd w:fill="ffffff" w:val="clear"/>
-            <w:vAlign w:val="center"/>
-          </w:tcPr>
-          <w:p>
-            <w:pPr>
-              <w:spacing w:after="0" w:line="240" w:lineRule="auto"/>
-              <w:jc w:val="center"/>
-              <w:rPr>
-                <w:rFonts w:ascii="Verdana" w:cs="Verdana" w:eastAsia="Verdana" w:hAnsi="Verdana"/>
-                <w:sz w:val="20"/>
-                <w:szCs w:val="20"/>
-              </w:rPr>
-            </w:pPr>
-            <w:r>
-              <w:rPr/>
-              <w:t>19/09/2026</w:t>
-            </w:r>
-          </w:p>
-          <w:p>
-            <w:pPr>
-              <w:spacing w:after="0" w:line="240" w:lineRule="auto"/>
-              <w:jc w:val="center"/>
-              <w:rPr>
-                <w:rFonts w:ascii="Verdana" w:cs="Verdana" w:eastAsia="Verdana" w:hAnsi="Verdana"/>
-                <w:sz w:val="20"/>
-                <w:szCs w:val="20"/>
-              </w:rPr>
-            </w:pPr>
-            <w:r>
-              <w:rPr/>
-              <w:t>8:00-9:00 am</w:t>
+              <w:t>10</w:t>
+            </w:r>
+          </w:p>
+        </w:tc>
+        <w:tc>
+          <w:tcPr>
+            <w:shd w:fill="ffffff" w:val="clear"/>
+            <w:vAlign w:val="center"/>
+          </w:tcPr>
+          <w:p>
+            <w:pPr>
+              <w:spacing w:after="0" w:line="240" w:lineRule="auto"/>
+              <w:jc w:val="center"/>
+              <w:rPr>
+                <w:rFonts w:ascii="Verdana" w:cs="Verdana" w:eastAsia="Verdana" w:hAnsi="Verdana"/>
+                <w:sz w:val="20"/>
+                <w:szCs w:val="20"/>
+              </w:rPr>
+            </w:pPr>
+            <w:r>
+              <w:rPr/>
+              <w:t>02/10/2026</w:t>
+            </w:r>
+          </w:p>
+          <w:p>
+            <w:pPr>
+              <w:spacing w:after="0" w:line="240" w:lineRule="auto"/>
+              <w:jc w:val="center"/>
+              <w:rPr>
+                <w:rFonts w:ascii="Verdana" w:cs="Verdana" w:eastAsia="Verdana" w:hAnsi="Verdana"/>
+                <w:sz w:val="20"/>
+                <w:szCs w:val="20"/>
+              </w:rPr>
+            </w:pPr>
+            <w:r>
+              <w:rPr/>
+              <w:t>2:00-3:00 pm</w:t>
             </w:r>
           </w:p>
         </w:tc>
@@ -2759,7 +2833,7 @@
             </w:pPr>
             <w:r>
               <w:rPr/>
-              <w:t>Encuentro presencial</w:t>
+              <w:t>Encuentro sincrónico (unidad desarrollada en inglés)</w:t>
             </w:r>
           </w:p>
           <w:p>
@@ -2776,7 +2850,7 @@
             </w:pPr>
             <w:r>
               <w:rPr/>
-              <w:t>Unidad 3. Abordajes de investigaciones en rehabilitación paliativa en falla de órgano</w:t>
+              <w:t>Unidad 4. Abordajes de investigaciones en rehabilitación paliativa en trastornos neurodegenerativos</w:t>
             </w:r>
           </w:p>
           <w:p>
@@ -2793,7 +2867,7 @@
             </w:pPr>
             <w:r>
               <w:rPr/>
-              <w:t>Tema 1. Rehabilitación física, funcional y social: rehabilitación cardiovascular e indicaciones para el control de síntomas</w:t>
+              <w:t>Tema 1. Rehabilitación en esclerosis múltiple y esclerosis lateral amiotrófica</w:t>
             </w:r>
           </w:p>
         </w:tc>
@@ -2877,22 +2951,22 @@
             </w:pPr>
             <w:r>
               <w:rPr/>
-              <w:t>19/09/2026</w:t>
-            </w:r>
-          </w:p>
-          <w:p>
-            <w:pPr>
-              <w:spacing w:after="0" w:line="240" w:lineRule="auto"/>
-              <w:jc w:val="center"/>
-              <w:rPr>
-                <w:rFonts w:ascii="Verdana" w:cs="Verdana" w:eastAsia="Verdana" w:hAnsi="Verdana"/>
-                <w:sz w:val="20"/>
-                <w:szCs w:val="20"/>
-              </w:rPr>
-            </w:pPr>
-            <w:r>
-              <w:rPr/>
-              <w:t>9:00-10:00 am</w:t>
+              <w:t>02/10/2026</w:t>
+            </w:r>
+          </w:p>
+          <w:p>
+            <w:pPr>
+              <w:spacing w:after="0" w:line="240" w:lineRule="auto"/>
+              <w:jc w:val="center"/>
+              <w:rPr>
+                <w:rFonts w:ascii="Verdana" w:cs="Verdana" w:eastAsia="Verdana" w:hAnsi="Verdana"/>
+                <w:sz w:val="20"/>
+                <w:szCs w:val="20"/>
+              </w:rPr>
+            </w:pPr>
+            <w:r>
+              <w:rPr/>
+              <w:t>3:00-4:00 pm</w:t>
             </w:r>
           </w:p>
         </w:tc>
@@ -2916,7 +2990,7 @@
             </w:pPr>
             <w:r>
               <w:rPr/>
-              <w:t>Tema 1. Manejo de la disfagia orofaríngea y trastornos de la deglución</w:t>
+              <w:t>Tema 1. Parálisis cerebral</w:t>
             </w:r>
           </w:p>
           <w:p>
@@ -2933,7 +3007,7 @@
             </w:pPr>
             <w:r>
               <w:rPr/>
-              <w:t>Tema 2. Ámbitos de rehabilitación (institucional, domiciliaria, comunitaria)</w:t>
+              <w:t>Tema 2. Ámbitos de rehabilitación: unidades de larga duración y programas de rehabilitación integral</w:t>
             </w:r>
           </w:p>
         </w:tc>
@@ -3009,22 +3083,22 @@
             </w:pPr>
             <w:r>
               <w:rPr/>
-              <w:t>19/09/2026</w:t>
-            </w:r>
-          </w:p>
-          <w:p>
-            <w:pPr>
-              <w:spacing w:after="0" w:line="240" w:lineRule="auto"/>
-              <w:jc w:val="center"/>
-              <w:rPr>
-                <w:rFonts w:ascii="Verdana" w:cs="Verdana" w:eastAsia="Verdana" w:hAnsi="Verdana"/>
-                <w:sz w:val="20"/>
-                <w:szCs w:val="20"/>
-              </w:rPr>
-            </w:pPr>
-            <w:r>
-              <w:rPr/>
-              <w:t>10:00-11:00 am</w:t>
+              <w:t>02/10/2026</w:t>
+            </w:r>
+          </w:p>
+          <w:p>
+            <w:pPr>
+              <w:spacing w:after="0" w:line="240" w:lineRule="auto"/>
+              <w:jc w:val="center"/>
+              <w:rPr>
+                <w:rFonts w:ascii="Verdana" w:cs="Verdana" w:eastAsia="Verdana" w:hAnsi="Verdana"/>
+                <w:sz w:val="20"/>
+                <w:szCs w:val="20"/>
+              </w:rPr>
+            </w:pPr>
+            <w:r>
+              <w:rPr/>
+              <w:t>4:00-5:00 pm</w:t>
             </w:r>
           </w:p>
         </w:tc>
@@ -3052,28 +3126,7 @@
                 <w:b/>
                 <w:sz w:val="20"/>
               </w:rPr>
-              <w:t>Tema 2. Programas de rehabilitación cardiopulmonar y rehabilitación domiciliaria</w:t>
-            </w:r>
-          </w:p>
-          <w:p>
-            <w:pPr>
-              <w:spacing w:after="0" w:line="240" w:lineRule="auto"/>
-              <w:jc w:val="center"/>
-              <w:rPr>
-                <w:rFonts w:ascii="Verdana" w:cs="Verdana" w:eastAsia="Verdana" w:hAnsi="Verdana"/>
-                <w:b w:val="1"/>
-                <w:bCs w:val="1"/>
-                <w:sz w:val="20"/>
-                <w:szCs w:val="20"/>
-              </w:rPr>
-            </w:pPr>
-            <w:r>
-              <w:rPr>
-                <w:rFonts w:ascii="Verdana" w:hAnsi="Verdana"/>
-                <w:b/>
-                <w:sz w:val="20"/>
-              </w:rPr>
-              <w:t>Tema 3. Medición de resultados funcionales</w:t>
+              <w:t>Tema 3. Medición de resultados funcionales en enfermedad neurodegenerativa</w:t>
             </w:r>
           </w:p>
         </w:tc>
@@ -3129,7 +3182,7 @@
             </w:pPr>
             <w:r>
               <w:rPr/>
-              <w:t>10</w:t>
+              <w:t>12</w:t>
             </w:r>
           </w:p>
         </w:tc>
@@ -3150,22 +3203,22 @@
             </w:pPr>
             <w:r>
               <w:rPr/>
-              <w:t>03/10/2026</w:t>
-            </w:r>
-          </w:p>
-          <w:p>
-            <w:pPr>
-              <w:spacing w:after="0" w:line="240" w:lineRule="auto"/>
-              <w:jc w:val="center"/>
-              <w:rPr>
-                <w:rFonts w:ascii="Verdana" w:cs="Verdana" w:eastAsia="Verdana" w:hAnsi="Verdana"/>
-                <w:sz w:val="20"/>
-                <w:szCs w:val="20"/>
-              </w:rPr>
-            </w:pPr>
-            <w:r>
-              <w:rPr/>
-              <w:t>8:00-9:00 am</w:t>
+              <w:t>16/10/2026</w:t>
+            </w:r>
+          </w:p>
+          <w:p>
+            <w:pPr>
+              <w:spacing w:after="0" w:line="240" w:lineRule="auto"/>
+              <w:jc w:val="center"/>
+              <w:rPr>
+                <w:rFonts w:ascii="Verdana" w:cs="Verdana" w:eastAsia="Verdana" w:hAnsi="Verdana"/>
+                <w:sz w:val="20"/>
+                <w:szCs w:val="20"/>
+              </w:rPr>
+            </w:pPr>
+            <w:r>
+              <w:rPr/>
+              <w:t>2:00-3:00 pm</w:t>
             </w:r>
           </w:p>
         </w:tc>
@@ -3187,7 +3240,7 @@
             </w:pPr>
             <w:r>
               <w:rPr/>
-              <w:t>Encuentro sincrónico (unidad desarrollada en inglés)</w:t>
+              <w:t>Encuentro presencial</w:t>
             </w:r>
           </w:p>
           <w:p>
@@ -3202,7 +3255,7 @@
             </w:pPr>
             <w:r>
               <w:rPr/>
-              <w:t>Unidad 4. Abordajes de investigaciones en rehabilitación paliativa en trastornos neurodegenerativos</w:t>
+              <w:t>Unidad 5. Abordajes de investigaciones en rehabilitación paliativa en demencia y fragilidad</w:t>
             </w:r>
           </w:p>
           <w:p>
@@ -3217,7 +3270,7 @@
             </w:pPr>
             <w:r>
               <w:rPr/>
-              <w:t>Tema 1. Rehabilitación en esclerosis múltiple y esclerosis lateral amiotrófica</w:t>
+              <w:t>Tema 1. Rehabilitación física y psicosocial: rehabilitación en demencias</w:t>
             </w:r>
           </w:p>
         </w:tc>
@@ -3294,22 +3347,22 @@
             </w:pPr>
             <w:r>
               <w:rPr/>
-              <w:t>03/10/2026</w:t>
-            </w:r>
-          </w:p>
-          <w:p>
-            <w:pPr>
-              <w:spacing w:after="0" w:line="240" w:lineRule="auto"/>
-              <w:jc w:val="center"/>
-              <w:rPr>
-                <w:rFonts w:ascii="Verdana" w:cs="Verdana" w:eastAsia="Verdana" w:hAnsi="Verdana"/>
-                <w:sz w:val="20"/>
-                <w:szCs w:val="20"/>
-              </w:rPr>
-            </w:pPr>
-            <w:r>
-              <w:rPr/>
-              <w:t>9:00-10:00 am</w:t>
+              <w:t>16/10/2026</w:t>
+            </w:r>
+          </w:p>
+          <w:p>
+            <w:pPr>
+              <w:spacing w:after="0" w:line="240" w:lineRule="auto"/>
+              <w:jc w:val="center"/>
+              <w:rPr>
+                <w:rFonts w:ascii="Verdana" w:cs="Verdana" w:eastAsia="Verdana" w:hAnsi="Verdana"/>
+                <w:sz w:val="20"/>
+                <w:szCs w:val="20"/>
+              </w:rPr>
+            </w:pPr>
+            <w:r>
+              <w:rPr/>
+              <w:t>3:00-4:00 pm</w:t>
             </w:r>
           </w:p>
         </w:tc>
@@ -3354,44 +3407,6 @@
             </w:pPr>
             <w:r>
               <w:rPr/>
-              <w:t>Tema 1. Parálisis cerebral</w:t>
-            </w:r>
-          </w:p>
-          <w:p>
-            <w:pPr>
-              <w:keepNext w:val="0"/>
-              <w:keepLines w:val="0"/>
-              <w:pageBreakBefore w:val="0"/>
-              <w:widowControl w:val="1"/>
-              <w:pBdr>
-                <w:top w:space="0" w:sz="0" w:val="nil"/>
-                <w:left w:space="0" w:sz="0" w:val="nil"/>
-                <w:bottom w:space="0" w:sz="0" w:val="nil"/>
-                <w:right w:space="0" w:sz="0" w:val="nil"/>
-                <w:between w:space="0" w:sz="0" w:val="nil"/>
-              </w:pBdr>
-              <w:shd w:fill="auto" w:val="clear"/>
-              <w:spacing w:after="0" w:before="0" w:line="240" w:lineRule="auto"/>
-              <w:ind w:left="851" w:right="0" w:firstLine="0"/>
-              <w:jc w:val="both"/>
-              <w:rPr>
-                <w:rFonts w:ascii="Verdana" w:cs="Verdana" w:eastAsia="Verdana" w:hAnsi="Verdana"/>
-                <w:b w:val="0"/>
-                <w:bCs w:val="0"/>
-                <w:i w:val="0"/>
-                <w:iCs w:val="0"/>
-                <w:smallCaps w:val="0"/>
-                <w:strike w:val="0"/>
-                <w:color w:val="000000"/>
-                <w:sz w:val="20"/>
-                <w:szCs w:val="20"/>
-                <w:u w:val="none"/>
-                <w:shd w:fill="auto" w:val="clear"/>
-                <w:vertAlign w:val="baseline"/>
-              </w:rPr>
-            </w:pPr>
-            <w:r>
-              <w:rPr/>
               <w:t>Tema 2. Ámbitos de rehabilitación: unidades de larga duración y programas de rehabilitación integral</w:t>
             </w:r>
           </w:p>
@@ -3468,22 +3483,22 @@
             </w:pPr>
             <w:r>
               <w:rPr/>
-              <w:t>03/10/2026</w:t>
-            </w:r>
-          </w:p>
-          <w:p>
-            <w:pPr>
-              <w:spacing w:after="0" w:line="240" w:lineRule="auto"/>
-              <w:jc w:val="center"/>
-              <w:rPr>
-                <w:rFonts w:ascii="Verdana" w:cs="Verdana" w:eastAsia="Verdana" w:hAnsi="Verdana"/>
-                <w:sz w:val="20"/>
-                <w:szCs w:val="20"/>
-              </w:rPr>
-            </w:pPr>
-            <w:r>
-              <w:rPr/>
-              <w:t>10:00-11:00 am</w:t>
+              <w:t>16/10/2026</w:t>
+            </w:r>
+          </w:p>
+          <w:p>
+            <w:pPr>
+              <w:spacing w:after="0" w:line="240" w:lineRule="auto"/>
+              <w:jc w:val="center"/>
+              <w:rPr>
+                <w:rFonts w:ascii="Verdana" w:cs="Verdana" w:eastAsia="Verdana" w:hAnsi="Verdana"/>
+                <w:sz w:val="20"/>
+                <w:szCs w:val="20"/>
+              </w:rPr>
+            </w:pPr>
+            <w:r>
+              <w:rPr/>
+              <w:t>4:00-5:00 pm</w:t>
             </w:r>
           </w:p>
         </w:tc>
@@ -3505,7 +3520,22 @@
             </w:pPr>
             <w:r>
               <w:rPr/>
-              <w:t>Tema 3. Medición de resultados funcionales en enfermedad neurodegenerativa</w:t>
+              <w:t>Tema 3. Medición de resultados en demencia y fragilidad: cambio mínimo importante</w:t>
+            </w:r>
+          </w:p>
+          <w:p>
+            <w:pPr>
+              <w:spacing w:after="0" w:line="240" w:lineRule="auto"/>
+              <w:jc w:val="both"/>
+              <w:rPr>
+                <w:rFonts w:ascii="Verdana" w:cs="Verdana" w:eastAsia="Verdana" w:hAnsi="Verdana"/>
+                <w:sz w:val="20"/>
+                <w:szCs w:val="20"/>
+              </w:rPr>
+            </w:pPr>
+            <w:r>
+              <w:rPr/>
+              <w:t>Entrega Segundo Producto 35 %</w:t>
             </w:r>
           </w:p>
         </w:tc>
@@ -3561,43 +3591,43 @@
             </w:pPr>
             <w:r>
               <w:rPr/>
-              <w:t>12</w:t>
-            </w:r>
-          </w:p>
-        </w:tc>
-        <w:tc>
-          <w:tcPr>
-            <w:shd w:fill="ffffff" w:val="clear"/>
-            <w:vAlign w:val="center"/>
-          </w:tcPr>
-          <w:p>
-            <w:pPr>
-              <w:spacing w:after="0" w:line="240" w:lineRule="auto"/>
-              <w:jc w:val="center"/>
-              <w:rPr>
-                <w:rFonts w:ascii="Verdana" w:cs="Verdana" w:eastAsia="Verdana" w:hAnsi="Verdana"/>
-                <w:sz w:val="20"/>
-                <w:szCs w:val="20"/>
-              </w:rPr>
-            </w:pPr>
-            <w:r>
-              <w:rPr/>
-              <w:t>17/10/2026</w:t>
-            </w:r>
-          </w:p>
-          <w:p>
-            <w:pPr>
-              <w:spacing w:after="0" w:line="240" w:lineRule="auto"/>
-              <w:jc w:val="center"/>
-              <w:rPr>
-                <w:rFonts w:ascii="Verdana" w:cs="Verdana" w:eastAsia="Verdana" w:hAnsi="Verdana"/>
-                <w:sz w:val="20"/>
-                <w:szCs w:val="20"/>
-              </w:rPr>
-            </w:pPr>
-            <w:r>
-              <w:rPr/>
-              <w:t>8:00-9:00 am</w:t>
+              <w:t>14</w:t>
+            </w:r>
+          </w:p>
+        </w:tc>
+        <w:tc>
+          <w:tcPr>
+            <w:shd w:fill="ffffff" w:val="clear"/>
+            <w:vAlign w:val="center"/>
+          </w:tcPr>
+          <w:p>
+            <w:pPr>
+              <w:spacing w:after="0" w:line="240" w:lineRule="auto"/>
+              <w:jc w:val="center"/>
+              <w:rPr>
+                <w:rFonts w:ascii="Verdana" w:cs="Verdana" w:eastAsia="Verdana" w:hAnsi="Verdana"/>
+                <w:sz w:val="20"/>
+                <w:szCs w:val="20"/>
+              </w:rPr>
+            </w:pPr>
+            <w:r>
+              <w:rPr/>
+              <w:t>30/10/2026</w:t>
+            </w:r>
+          </w:p>
+          <w:p>
+            <w:pPr>
+              <w:spacing w:after="0" w:line="240" w:lineRule="auto"/>
+              <w:jc w:val="center"/>
+              <w:rPr>
+                <w:rFonts w:ascii="Verdana" w:cs="Verdana" w:eastAsia="Verdana" w:hAnsi="Verdana"/>
+                <w:sz w:val="20"/>
+                <w:szCs w:val="20"/>
+              </w:rPr>
+            </w:pPr>
+            <w:r>
+              <w:rPr/>
+              <w:t>2:00-3:00 pm</w:t>
             </w:r>
           </w:p>
         </w:tc>
@@ -3619,7 +3649,7 @@
             </w:pPr>
             <w:r>
               <w:rPr/>
-              <w:t>Encuentro presencial</w:t>
+              <w:t>Encuentro sincrónico</w:t>
             </w:r>
           </w:p>
           <w:p>
@@ -3634,7 +3664,7 @@
             </w:pPr>
             <w:r>
               <w:rPr/>
-              <w:t>Unidad 5. Abordajes de investigaciones en rehabilitación paliativa en demencia y fragilidad</w:t>
+              <w:t>Unidad 6. Abordajes de investigaciones en rehabilitación paliativa en eventos catastróficos (ictus severo, fractura de cadera del adulto mayor)</w:t>
             </w:r>
           </w:p>
           <w:p>
@@ -3649,7 +3679,7 @@
             </w:pPr>
             <w:r>
               <w:rPr/>
-              <w:t>Tema 1. Rehabilitación física y psicosocial: rehabilitación en demencias</w:t>
+              <w:t>Tema 1. Rehabilitación física y psicosocial: rehabilitación en geriatría y espasticidad</w:t>
             </w:r>
           </w:p>
         </w:tc>
@@ -3726,22 +3756,22 @@
             </w:pPr>
             <w:r>
               <w:rPr/>
-              <w:t>17/10/2026</w:t>
-            </w:r>
-          </w:p>
-          <w:p>
-            <w:pPr>
-              <w:spacing w:after="0" w:line="240" w:lineRule="auto"/>
-              <w:jc w:val="center"/>
-              <w:rPr>
-                <w:rFonts w:ascii="Verdana" w:cs="Verdana" w:eastAsia="Verdana" w:hAnsi="Verdana"/>
-                <w:sz w:val="20"/>
-                <w:szCs w:val="20"/>
-              </w:rPr>
-            </w:pPr>
-            <w:r>
-              <w:rPr/>
-              <w:t>9:00-10:00 am</w:t>
+              <w:t>30/10/2026</w:t>
+            </w:r>
+          </w:p>
+          <w:p>
+            <w:pPr>
+              <w:spacing w:after="0" w:line="240" w:lineRule="auto"/>
+              <w:jc w:val="center"/>
+              <w:rPr>
+                <w:rFonts w:ascii="Verdana" w:cs="Verdana" w:eastAsia="Verdana" w:hAnsi="Verdana"/>
+                <w:sz w:val="20"/>
+                <w:szCs w:val="20"/>
+              </w:rPr>
+            </w:pPr>
+            <w:r>
+              <w:rPr/>
+              <w:t>3:00-4:00 pm</w:t>
             </w:r>
           </w:p>
         </w:tc>
@@ -3763,7 +3793,7 @@
             </w:pPr>
             <w:r>
               <w:rPr/>
-              <w:t>Tema 2. Ámbitos de rehabilitación: unidades de larga duración y programas de rehabilitación integral</w:t>
+              <w:t>Tema 2. Ámbitos de rehabilitación (institucional, domiciliaria, comunitaria)</w:t>
             </w:r>
           </w:p>
         </w:tc>
@@ -3839,22 +3869,22 @@
             </w:pPr>
             <w:r>
               <w:rPr/>
-              <w:t>17/10/2026</w:t>
-            </w:r>
-          </w:p>
-          <w:p>
-            <w:pPr>
-              <w:spacing w:after="0" w:line="240" w:lineRule="auto"/>
-              <w:jc w:val="center"/>
-              <w:rPr>
-                <w:rFonts w:ascii="Verdana" w:cs="Verdana" w:eastAsia="Verdana" w:hAnsi="Verdana"/>
-                <w:sz w:val="20"/>
-                <w:szCs w:val="20"/>
-              </w:rPr>
-            </w:pPr>
-            <w:r>
-              <w:rPr/>
-              <w:t>10:00-11:00 am</w:t>
+              <w:t>30/10/2026</w:t>
+            </w:r>
+          </w:p>
+          <w:p>
+            <w:pPr>
+              <w:spacing w:after="0" w:line="240" w:lineRule="auto"/>
+              <w:jc w:val="center"/>
+              <w:rPr>
+                <w:rFonts w:ascii="Verdana" w:cs="Verdana" w:eastAsia="Verdana" w:hAnsi="Verdana"/>
+                <w:sz w:val="20"/>
+                <w:szCs w:val="20"/>
+              </w:rPr>
+            </w:pPr>
+            <w:r>
+              <w:rPr/>
+              <w:t>4:00-5:00 pm</w:t>
             </w:r>
           </w:p>
         </w:tc>
@@ -3876,22 +3906,7 @@
             </w:pPr>
             <w:r>
               <w:rPr/>
-              <w:t>Tema 3. Medición de resultados en demencia y fragilidad: cambio mínimo importante</w:t>
-            </w:r>
-          </w:p>
-          <w:p>
-            <w:pPr>
-              <w:spacing w:after="0" w:line="240" w:lineRule="auto"/>
-              <w:jc w:val="both"/>
-              <w:rPr>
-                <w:rFonts w:ascii="Verdana" w:cs="Verdana" w:eastAsia="Verdana" w:hAnsi="Verdana"/>
-                <w:sz w:val="20"/>
-                <w:szCs w:val="20"/>
-              </w:rPr>
-            </w:pPr>
-            <w:r>
-              <w:rPr/>
-              <w:t>Entrega Segundo Producto 35 %</w:t>
+              <w:t>Tema 3. Medición de resultados en rehabilitación del adulto mayor</w:t>
             </w:r>
           </w:p>
         </w:tc>
@@ -3947,43 +3962,28 @@
             </w:pPr>
             <w:r>
               <w:rPr/>
-              <w:t>14</w:t>
-            </w:r>
-          </w:p>
-        </w:tc>
-        <w:tc>
-          <w:tcPr>
-            <w:shd w:fill="ffffff" w:val="clear"/>
-            <w:vAlign w:val="center"/>
-          </w:tcPr>
-          <w:p>
-            <w:pPr>
-              <w:spacing w:after="0" w:line="240" w:lineRule="auto"/>
-              <w:jc w:val="center"/>
-              <w:rPr>
-                <w:rFonts w:ascii="Verdana" w:cs="Verdana" w:eastAsia="Verdana" w:hAnsi="Verdana"/>
-                <w:sz w:val="20"/>
-                <w:szCs w:val="20"/>
-              </w:rPr>
-            </w:pPr>
-            <w:r>
-              <w:rPr/>
-              <w:t>31/10/2026</w:t>
-            </w:r>
-          </w:p>
-          <w:p>
-            <w:pPr>
-              <w:spacing w:after="0" w:line="240" w:lineRule="auto"/>
-              <w:jc w:val="center"/>
-              <w:rPr>
-                <w:rFonts w:ascii="Verdana" w:cs="Verdana" w:eastAsia="Verdana" w:hAnsi="Verdana"/>
-                <w:sz w:val="20"/>
-                <w:szCs w:val="20"/>
-              </w:rPr>
-            </w:pPr>
-            <w:r>
-              <w:rPr/>
-              <w:t>8:00-9:00 am</w:t>
+              <w:t>16</w:t>
+            </w:r>
+          </w:p>
+        </w:tc>
+        <w:tc>
+          <w:tcPr>
+            <w:shd w:fill="ffffff" w:val="clear"/>
+            <w:vAlign w:val="center"/>
+          </w:tcPr>
+          <w:p>
+            <w:pPr>
+              <w:spacing w:after="0" w:line="240" w:lineRule="auto"/>
+              <w:jc w:val="center"/>
+              <w:rPr>
+                <w:rFonts w:ascii="Verdana" w:cs="Verdana" w:eastAsia="Verdana" w:hAnsi="Verdana"/>
+                <w:sz w:val="20"/>
+                <w:szCs w:val="20"/>
+              </w:rPr>
+            </w:pPr>
+            <w:r>
+              <w:rPr/>
+              <w:t>13/11/2026</w:t>
             </w:r>
           </w:p>
         </w:tc>
@@ -4005,7 +4005,7 @@
             </w:pPr>
             <w:r>
               <w:rPr/>
-              <w:t>Encuentro sincrónico</w:t>
+              <w:t>Encuentro de investigación — sustentaciones de tesis</w:t>
             </w:r>
           </w:p>
           <w:p>
@@ -4020,47 +4020,31 @@
             </w:pPr>
             <w:r>
               <w:rPr/>
-              <w:t>Unidad 6. Abordajes de investigaciones en rehabilitación paliativa en eventos catastróficos (ictus severo, fractura de cadera del adulto mayor)</w:t>
-            </w:r>
-          </w:p>
-          <w:p>
-            <w:pPr>
-              <w:spacing w:after="0" w:line="240" w:lineRule="auto"/>
-              <w:jc w:val="both"/>
-              <w:rPr>
-                <w:rFonts w:ascii="Verdana" w:cs="Verdana" w:eastAsia="Verdana" w:hAnsi="Verdana"/>
-                <w:sz w:val="20"/>
-                <w:szCs w:val="20"/>
-              </w:rPr>
-            </w:pPr>
-            <w:r>
-              <w:rPr/>
-              <w:t>Tema 1. Rehabilitación física y psicosocial: rehabilitación en geriatría y espasticidad</w:t>
-            </w:r>
-          </w:p>
-        </w:tc>
-        <w:tc>
-          <w:tcPr>
-            <w:shd w:fill="ffffff" w:val="clear"/>
-            <w:vAlign w:val="center"/>
-          </w:tcPr>
-          <w:p>
-            <w:pPr>
-              <w:tabs>
-                <w:tab w:val="left" w:leader="none" w:pos="4809"/>
-                <w:tab w:val="left" w:leader="none" w:pos="10009"/>
-              </w:tabs>
-              <w:spacing w:after="0" w:line="240" w:lineRule="auto"/>
-              <w:jc w:val="center"/>
-              <w:rPr>
-                <w:rFonts w:ascii="Verdana" w:cs="Verdana" w:eastAsia="Verdana" w:hAnsi="Verdana"/>
-                <w:sz w:val="20"/>
-                <w:szCs w:val="20"/>
-              </w:rPr>
-            </w:pPr>
-            <w:r>
-              <w:rPr/>
-              <w:t>Jorge Wilhem Bogoya López</w:t>
+              <w:t>(Solo para estudiantes de Tesis II. No corresponde a este espacio académico)</w:t>
+            </w:r>
+          </w:p>
+        </w:tc>
+        <w:tc>
+          <w:tcPr>
+            <w:shd w:fill="ffffff" w:val="clear"/>
+            <w:vAlign w:val="center"/>
+          </w:tcPr>
+          <w:p>
+            <w:pPr>
+              <w:tabs>
+                <w:tab w:val="left" w:leader="none" w:pos="4809"/>
+                <w:tab w:val="left" w:leader="none" w:pos="10009"/>
+              </w:tabs>
+              <w:spacing w:after="0" w:line="240" w:lineRule="auto"/>
+              <w:jc w:val="center"/>
+              <w:rPr>
+                <w:rFonts w:ascii="Verdana" w:cs="Verdana" w:eastAsia="Verdana" w:hAnsi="Verdana"/>
+                <w:sz w:val="20"/>
+                <w:szCs w:val="20"/>
+              </w:rPr>
+            </w:pPr>
+            <w:r>
+              <w:rPr/>
             </w:r>
           </w:p>
         </w:tc>
@@ -4092,42 +4076,43 @@
             </w:pPr>
             <w:r>
               <w:rPr/>
-            </w:r>
-          </w:p>
-        </w:tc>
-        <w:tc>
-          <w:tcPr>
-            <w:shd w:fill="ffffff" w:val="clear"/>
-            <w:vAlign w:val="center"/>
-          </w:tcPr>
-          <w:p>
-            <w:pPr>
-              <w:spacing w:after="0" w:line="240" w:lineRule="auto"/>
-              <w:jc w:val="center"/>
-              <w:rPr>
-                <w:rFonts w:ascii="Verdana" w:cs="Verdana" w:eastAsia="Verdana" w:hAnsi="Verdana"/>
-                <w:sz w:val="20"/>
-                <w:szCs w:val="20"/>
-              </w:rPr>
-            </w:pPr>
-            <w:r>
-              <w:rPr/>
-              <w:t>31/10/2026</w:t>
-            </w:r>
-          </w:p>
-          <w:p>
-            <w:pPr>
-              <w:spacing w:after="0" w:line="240" w:lineRule="auto"/>
-              <w:jc w:val="center"/>
-              <w:rPr>
-                <w:rFonts w:ascii="Verdana" w:cs="Verdana" w:eastAsia="Verdana" w:hAnsi="Verdana"/>
-                <w:sz w:val="20"/>
-                <w:szCs w:val="20"/>
-              </w:rPr>
-            </w:pPr>
-            <w:r>
-              <w:rPr/>
-              <w:t>9:00-10:00 am</w:t>
+              <w:t>17</w:t>
+            </w:r>
+          </w:p>
+        </w:tc>
+        <w:tc>
+          <w:tcPr>
+            <w:shd w:fill="ffffff" w:val="clear"/>
+            <w:vAlign w:val="center"/>
+          </w:tcPr>
+          <w:p>
+            <w:pPr>
+              <w:spacing w:after="0" w:line="240" w:lineRule="auto"/>
+              <w:jc w:val="center"/>
+              <w:rPr>
+                <w:rFonts w:ascii="Verdana" w:cs="Verdana" w:eastAsia="Verdana" w:hAnsi="Verdana"/>
+                <w:sz w:val="20"/>
+                <w:szCs w:val="20"/>
+              </w:rPr>
+            </w:pPr>
+            <w:r>
+              <w:rPr/>
+              <w:t>20/11/2026</w:t>
+            </w:r>
+          </w:p>
+          <w:p>
+            <w:pPr>
+              <w:spacing w:after="0" w:line="240" w:lineRule="auto"/>
+              <w:jc w:val="center"/>
+              <w:rPr>
+                <w:rFonts w:ascii="Verdana" w:cs="Verdana" w:eastAsia="Verdana" w:hAnsi="Verdana"/>
+                <w:sz w:val="20"/>
+                <w:szCs w:val="20"/>
+              </w:rPr>
+            </w:pPr>
+            <w:r>
+              <w:rPr/>
+              <w:t>2:00-3:00 pm</w:t>
             </w:r>
           </w:p>
         </w:tc>
@@ -4153,31 +4138,51 @@
                 <w:b/>
                 <w:sz w:val="20"/>
               </w:rPr>
-              <w:t>Tema 2. Ámbitos de rehabilitación (institucional, domiciliaria, comunitaria)</w:t>
-            </w:r>
-          </w:p>
-        </w:tc>
-        <w:tc>
-          <w:tcPr>
-            <w:shd w:fill="ffffff" w:val="clear"/>
-            <w:vAlign w:val="center"/>
-          </w:tcPr>
-          <w:p>
-            <w:pPr>
-              <w:tabs>
-                <w:tab w:val="left" w:leader="none" w:pos="4809"/>
-                <w:tab w:val="left" w:leader="none" w:pos="10009"/>
-              </w:tabs>
-              <w:spacing w:after="0" w:line="240" w:lineRule="auto"/>
-              <w:jc w:val="center"/>
-              <w:rPr>
-                <w:rFonts w:ascii="Verdana" w:cs="Verdana" w:eastAsia="Verdana" w:hAnsi="Verdana"/>
-                <w:sz w:val="20"/>
-                <w:szCs w:val="20"/>
-              </w:rPr>
-            </w:pPr>
-            <w:r>
-              <w:rPr/>
+              <w:t>Encuentro presencial</w:t>
+            </w:r>
+          </w:p>
+          <w:p>
+            <w:pPr>
+              <w:spacing w:after="0" w:line="240" w:lineRule="auto"/>
+              <w:jc w:val="center"/>
+              <w:rPr>
+                <w:rFonts w:ascii="Verdana" w:cs="Verdana" w:eastAsia="Verdana" w:hAnsi="Verdana"/>
+                <w:sz w:val="20"/>
+                <w:szCs w:val="20"/>
+              </w:rPr>
+            </w:pPr>
+            <w:r>
+              <w:rPr>
+                <w:rFonts w:ascii="Verdana" w:hAnsi="Verdana"/>
+                <w:b/>
+                <w:sz w:val="20"/>
+              </w:rPr>
+              <w:t>Seminario integrador de las seis unidades del espacio académico</w:t>
+            </w:r>
+          </w:p>
+        </w:tc>
+        <w:tc>
+          <w:tcPr>
+            <w:shd w:fill="ffffff" w:val="clear"/>
+            <w:vAlign w:val="center"/>
+          </w:tcPr>
+          <w:p>
+            <w:pPr>
+              <w:tabs>
+                <w:tab w:val="left" w:leader="none" w:pos="4809"/>
+                <w:tab w:val="left" w:leader="none" w:pos="10009"/>
+              </w:tabs>
+              <w:spacing w:after="0" w:line="240" w:lineRule="auto"/>
+              <w:jc w:val="center"/>
+              <w:rPr>
+                <w:rFonts w:ascii="Verdana" w:cs="Verdana" w:eastAsia="Verdana" w:hAnsi="Verdana"/>
+                <w:sz w:val="20"/>
+                <w:szCs w:val="20"/>
+              </w:rPr>
+            </w:pPr>
+            <w:r>
+              <w:rPr/>
+              <w:t>Jorge Wilhem Bogoya López</w:t>
             </w:r>
           </w:p>
         </w:tc>
@@ -4229,22 +4234,22 @@
             </w:pPr>
             <w:r>
               <w:rPr/>
-              <w:t>31/10/2026</w:t>
-            </w:r>
-          </w:p>
-          <w:p>
-            <w:pPr>
-              <w:spacing w:after="0" w:line="240" w:lineRule="auto"/>
-              <w:jc w:val="center"/>
-              <w:rPr>
-                <w:rFonts w:ascii="Verdana" w:cs="Verdana" w:eastAsia="Verdana" w:hAnsi="Verdana"/>
-                <w:sz w:val="20"/>
-                <w:szCs w:val="20"/>
-              </w:rPr>
-            </w:pPr>
-            <w:r>
-              <w:rPr/>
-              <w:t>10:00-11:00 am</w:t>
+              <w:t>20/11/2026</w:t>
+            </w:r>
+          </w:p>
+          <w:p>
+            <w:pPr>
+              <w:spacing w:after="0" w:line="240" w:lineRule="auto"/>
+              <w:jc w:val="center"/>
+              <w:rPr>
+                <w:rFonts w:ascii="Verdana" w:cs="Verdana" w:eastAsia="Verdana" w:hAnsi="Verdana"/>
+                <w:sz w:val="20"/>
+                <w:szCs w:val="20"/>
+              </w:rPr>
+            </w:pPr>
+            <w:r>
+              <w:rPr/>
+              <w:t>3:00-4:00 pm</w:t>
             </w:r>
           </w:p>
         </w:tc>
@@ -4266,7 +4271,7 @@
             </w:pPr>
             <w:r>
               <w:rPr/>
-              <w:t>Tema 3. Medición de resultados en rehabilitación del adulto mayor</w:t>
+              <w:t>Socialización de los productos finales de investigación en rehabilitación paliativa</w:t>
             </w:r>
           </w:p>
         </w:tc>
@@ -4322,43 +4327,42 @@
             </w:pPr>
             <w:r>
               <w:rPr/>
-              <w:t>17</w:t>
-            </w:r>
-          </w:p>
-        </w:tc>
-        <w:tc>
-          <w:tcPr>
-            <w:shd w:fill="ffffff" w:val="clear"/>
-            <w:vAlign w:val="center"/>
-          </w:tcPr>
-          <w:p>
-            <w:pPr>
-              <w:spacing w:after="0" w:line="240" w:lineRule="auto"/>
-              <w:jc w:val="center"/>
-              <w:rPr>
-                <w:rFonts w:ascii="Verdana" w:cs="Verdana" w:eastAsia="Verdana" w:hAnsi="Verdana"/>
-                <w:sz w:val="20"/>
-                <w:szCs w:val="20"/>
-              </w:rPr>
-            </w:pPr>
-            <w:r>
-              <w:rPr/>
-              <w:t>21/11/2026</w:t>
-            </w:r>
-          </w:p>
-          <w:p>
-            <w:pPr>
-              <w:spacing w:after="0" w:line="240" w:lineRule="auto"/>
-              <w:jc w:val="center"/>
-              <w:rPr>
-                <w:rFonts w:ascii="Verdana" w:cs="Verdana" w:eastAsia="Verdana" w:hAnsi="Verdana"/>
-                <w:sz w:val="20"/>
-                <w:szCs w:val="20"/>
-              </w:rPr>
-            </w:pPr>
-            <w:r>
-              <w:rPr/>
-              <w:t>8:00-9:00 am</w:t>
+            </w:r>
+          </w:p>
+        </w:tc>
+        <w:tc>
+          <w:tcPr>
+            <w:shd w:fill="ffffff" w:val="clear"/>
+            <w:vAlign w:val="center"/>
+          </w:tcPr>
+          <w:p>
+            <w:pPr>
+              <w:spacing w:after="0" w:line="240" w:lineRule="auto"/>
+              <w:jc w:val="center"/>
+              <w:rPr>
+                <w:rFonts w:ascii="Verdana" w:cs="Verdana" w:eastAsia="Verdana" w:hAnsi="Verdana"/>
+                <w:sz w:val="20"/>
+                <w:szCs w:val="20"/>
+              </w:rPr>
+            </w:pPr>
+            <w:r>
+              <w:rPr/>
+              <w:t>20/11/2026</w:t>
+            </w:r>
+          </w:p>
+          <w:p>
+            <w:pPr>
+              <w:spacing w:after="0" w:line="240" w:lineRule="auto"/>
+              <w:jc w:val="center"/>
+              <w:rPr>
+                <w:rFonts w:ascii="Verdana" w:cs="Verdana" w:eastAsia="Verdana" w:hAnsi="Verdana"/>
+                <w:sz w:val="20"/>
+                <w:szCs w:val="20"/>
+              </w:rPr>
+            </w:pPr>
+            <w:r>
+              <w:rPr/>
+              <w:t>4:00-5:00 pm</w:t>
             </w:r>
           </w:p>
         </w:tc>
@@ -4382,7 +4386,7 @@
             </w:pPr>
             <w:r>
               <w:rPr/>
-              <w:t>Encuentro presencial</w:t>
+              <w:t>Coevaluación, autoevaluación y cierre del espacio académico</w:t>
             </w:r>
           </w:p>
           <w:p>
@@ -4399,262 +4403,6 @@
             </w:pPr>
             <w:r>
               <w:rPr/>
-              <w:t>Seminario integrador de las seis unidades del espacio académico</w:t>
-            </w:r>
-          </w:p>
-        </w:tc>
-        <w:tc>
-          <w:tcPr>
-            <w:shd w:fill="ffffff" w:val="clear"/>
-            <w:vAlign w:val="center"/>
-          </w:tcPr>
-          <w:p>
-            <w:pPr>
-              <w:tabs>
-                <w:tab w:val="left" w:leader="none" w:pos="4809"/>
-                <w:tab w:val="left" w:leader="none" w:pos="10009"/>
-              </w:tabs>
-              <w:spacing w:after="0" w:line="240" w:lineRule="auto"/>
-              <w:jc w:val="center"/>
-              <w:rPr>
-                <w:rFonts w:ascii="Verdana" w:cs="Verdana" w:eastAsia="Verdana" w:hAnsi="Verdana"/>
-                <w:sz w:val="20"/>
-                <w:szCs w:val="20"/>
-              </w:rPr>
-            </w:pPr>
-            <w:r>
-              <w:rPr/>
-              <w:t>Jorge Wilhem Bogoya López</w:t>
-            </w:r>
-          </w:p>
-        </w:tc>
-      </w:tr>
-      <w:tr>
-        <w:trPr>
-          <w:cantSplit w:val="0"/>
-          <w:trHeight w:val="20" w:hRule="atLeast"/>
-          <w:tblHeader w:val="0"/>
-        </w:trPr>
-        <w:tc>
-          <w:tcPr>
-            <w:shd w:fill="ffffff" w:val="clear"/>
-            <w:vAlign w:val="center"/>
-          </w:tcPr>
-          <w:p>
-            <w:pPr>
-              <w:tabs>
-                <w:tab w:val="left" w:leader="none" w:pos="4809"/>
-                <w:tab w:val="left" w:leader="none" w:pos="10009"/>
-              </w:tabs>
-              <w:spacing w:after="0" w:line="240" w:lineRule="auto"/>
-              <w:jc w:val="center"/>
-              <w:rPr>
-                <w:rFonts w:ascii="Verdana" w:cs="Verdana" w:eastAsia="Verdana" w:hAnsi="Verdana"/>
-                <w:sz w:val="20"/>
-                <w:szCs w:val="20"/>
-              </w:rPr>
-            </w:pPr>
-            <w:r>
-              <w:rPr/>
-            </w:r>
-          </w:p>
-        </w:tc>
-        <w:tc>
-          <w:tcPr>
-            <w:shd w:fill="ffffff" w:val="clear"/>
-            <w:vAlign w:val="center"/>
-          </w:tcPr>
-          <w:p>
-            <w:pPr>
-              <w:spacing w:after="0" w:line="240" w:lineRule="auto"/>
-              <w:jc w:val="center"/>
-              <w:rPr>
-                <w:rFonts w:ascii="Verdana" w:cs="Verdana" w:eastAsia="Verdana" w:hAnsi="Verdana"/>
-                <w:sz w:val="20"/>
-                <w:szCs w:val="20"/>
-              </w:rPr>
-            </w:pPr>
-            <w:r>
-              <w:rPr/>
-              <w:t>21/11/2026</w:t>
-            </w:r>
-          </w:p>
-          <w:p>
-            <w:pPr>
-              <w:spacing w:after="0" w:line="240" w:lineRule="auto"/>
-              <w:jc w:val="center"/>
-              <w:rPr>
-                <w:rFonts w:ascii="Verdana" w:cs="Verdana" w:eastAsia="Verdana" w:hAnsi="Verdana"/>
-                <w:sz w:val="20"/>
-                <w:szCs w:val="20"/>
-              </w:rPr>
-            </w:pPr>
-            <w:r>
-              <w:rPr/>
-              <w:t>9:00-10:00 am</w:t>
-            </w:r>
-          </w:p>
-        </w:tc>
-        <w:tc>
-          <w:tcPr>
-            <w:gridSpan w:val="2"/>
-            <w:shd w:fill="ffffff" w:val="clear"/>
-            <w:vAlign w:val="center"/>
-          </w:tcPr>
-          <w:p>
-            <w:pPr>
-              <w:spacing w:after="0" w:line="240" w:lineRule="auto"/>
-              <w:jc w:val="both"/>
-              <w:rPr>
-                <w:rFonts w:ascii="Verdana" w:cs="Verdana" w:eastAsia="Verdana" w:hAnsi="Verdana"/>
-                <w:b w:val="1"/>
-                <w:bCs w:val="1"/>
-                <w:sz w:val="20"/>
-                <w:szCs w:val="20"/>
-              </w:rPr>
-            </w:pPr>
-            <w:r>
-              <w:rPr/>
-              <w:t>Socialización de los productos finales de investigación en rehabilitación paliativa</w:t>
-            </w:r>
-          </w:p>
-        </w:tc>
-        <w:tc>
-          <w:tcPr>
-            <w:shd w:fill="ffffff" w:val="clear"/>
-            <w:vAlign w:val="center"/>
-          </w:tcPr>
-          <w:p>
-            <w:pPr>
-              <w:tabs>
-                <w:tab w:val="left" w:leader="none" w:pos="4809"/>
-                <w:tab w:val="left" w:leader="none" w:pos="10009"/>
-              </w:tabs>
-              <w:spacing w:after="0" w:line="240" w:lineRule="auto"/>
-              <w:jc w:val="center"/>
-              <w:rPr>
-                <w:rFonts w:ascii="Verdana" w:cs="Verdana" w:eastAsia="Verdana" w:hAnsi="Verdana"/>
-                <w:sz w:val="20"/>
-                <w:szCs w:val="20"/>
-              </w:rPr>
-            </w:pPr>
-            <w:r>
-              <w:rPr/>
-            </w:r>
-          </w:p>
-        </w:tc>
-      </w:tr>
-      <w:tr>
-        <w:trPr>
-          <w:cantSplit w:val="0"/>
-          <w:trHeight w:val="20" w:hRule="atLeast"/>
-          <w:tblHeader w:val="0"/>
-        </w:trPr>
-        <w:tc>
-          <w:tcPr>
-            <w:shd w:fill="ffffff" w:val="clear"/>
-            <w:vAlign w:val="center"/>
-          </w:tcPr>
-          <w:p>
-            <w:pPr>
-              <w:tabs>
-                <w:tab w:val="left" w:leader="none" w:pos="4809"/>
-                <w:tab w:val="left" w:leader="none" w:pos="10009"/>
-              </w:tabs>
-              <w:spacing w:after="0" w:line="240" w:lineRule="auto"/>
-              <w:jc w:val="center"/>
-              <w:rPr>
-                <w:rFonts w:ascii="Verdana" w:cs="Verdana" w:eastAsia="Verdana" w:hAnsi="Verdana"/>
-                <w:sz w:val="20"/>
-                <w:szCs w:val="20"/>
-              </w:rPr>
-            </w:pPr>
-            <w:r>
-              <w:rPr/>
-            </w:r>
-          </w:p>
-        </w:tc>
-        <w:tc>
-          <w:tcPr>
-            <w:shd w:fill="ffffff" w:val="clear"/>
-            <w:vAlign w:val="center"/>
-          </w:tcPr>
-          <w:p>
-            <w:pPr>
-              <w:spacing w:after="0" w:line="240" w:lineRule="auto"/>
-              <w:jc w:val="center"/>
-              <w:rPr>
-                <w:rFonts w:ascii="Verdana" w:cs="Verdana" w:eastAsia="Verdana" w:hAnsi="Verdana"/>
-                <w:sz w:val="20"/>
-                <w:szCs w:val="20"/>
-              </w:rPr>
-            </w:pPr>
-            <w:r>
-              <w:rPr/>
-              <w:t>21/11/2026</w:t>
-            </w:r>
-          </w:p>
-          <w:p>
-            <w:pPr>
-              <w:spacing w:after="0" w:line="240" w:lineRule="auto"/>
-              <w:jc w:val="center"/>
-              <w:rPr>
-                <w:rFonts w:ascii="Verdana" w:cs="Verdana" w:eastAsia="Verdana" w:hAnsi="Verdana"/>
-                <w:sz w:val="20"/>
-                <w:szCs w:val="20"/>
-              </w:rPr>
-            </w:pPr>
-            <w:r>
-              <w:rPr/>
-              <w:t>10:00-11:00 am</w:t>
-            </w:r>
-          </w:p>
-        </w:tc>
-        <w:tc>
-          <w:tcPr>
-            <w:gridSpan w:val="2"/>
-            <w:shd w:fill="ffffff" w:val="clear"/>
-            <w:vAlign w:val="center"/>
-          </w:tcPr>
-          <w:p>
-            <w:pPr>
-              <w:spacing w:after="0" w:line="240" w:lineRule="auto"/>
-              <w:jc w:val="center"/>
-              <w:rPr>
-                <w:rFonts w:ascii="Verdana" w:cs="Verdana" w:eastAsia="Verdana" w:hAnsi="Verdana"/>
-                <w:b w:val="1"/>
-                <w:bCs w:val="1"/>
-                <w:sz w:val="20"/>
-                <w:szCs w:val="20"/>
-              </w:rPr>
-            </w:pPr>
-            <w:r>
-              <w:rPr>
-                <w:rFonts w:ascii="Verdana" w:hAnsi="Verdana"/>
-                <w:b/>
-                <w:sz w:val="20"/>
-              </w:rPr>
-              <w:t>Coevaluación, autoevaluación y cierre del espacio académico</w:t>
-            </w:r>
-          </w:p>
-          <w:p>
-            <w:pPr>
-              <w:spacing w:after="0" w:line="240" w:lineRule="auto"/>
-              <w:jc w:val="center"/>
-              <w:rPr>
-                <w:rFonts w:ascii="Verdana" w:cs="Verdana" w:eastAsia="Verdana" w:hAnsi="Verdana"/>
-                <w:b w:val="1"/>
-                <w:bCs w:val="1"/>
-                <w:sz w:val="20"/>
-                <w:szCs w:val="20"/>
-              </w:rPr>
-            </w:pPr>
-            <w:r>
-              <w:rPr>
-                <w:rFonts w:ascii="Verdana" w:hAnsi="Verdana"/>
-                <w:b/>
-                <w:sz w:val="20"/>
-              </w:rPr>
               <w:t>Entrega Producto Final 30 %</w:t>
             </w:r>
           </w:p>
@@ -4724,7 +4472,7 @@
           <w:i/>
           <w:sz w:val="16"/>
         </w:rPr>
-        <w:t>Nota. La programación sigue el calendario oficial de encuentros académicos 2026-II de la Maestría (comunicación de la Dirección, «HORARIOS 2026 - II») y la franja de este espacio académico, sábados de 8:00 a 11:00, con ocho sesiones (8 y 22 de agosto; 5 y 19 de septiembre; 3, 17 y 31 de octubre; 21 de noviembre). Puntos por confirmar con la Dirección: (1) la franja de sábado de 8:00 a 11:00 y la inclusión del sábado 8 de agosto son un supuesto de esta programación, pues el calendario oficial fija los fines de semana de encuentro para toda la Maestría pero no la franja de cada asignatura; si la franja fuera otra, cambian las fechas y el número de sesiones. (2) Las 48 horas presenciales declaradas en el contenido programático corresponden a 24 horas de encuentro efectivas (8 × 3 h); se registran las declaradas por coherencia con el contenido programático aprobado. (3) El encuentro del 13 de noviembre es de sustentaciones de tesis II y no corresponde a este espacio académico. Evaluación por productos de corte: primer corte 35 %, segundo corte 35 %, producto final 30 %.</w:t>
+        <w:t>Nota. La programación sigue el calendario oficial de encuentros académicos 2026-II de la Maestría (comunicación de la Dirección, «HORARIOS 2026 - II») y la franja de este espacio académico, viernes de 2:00 a 5:00 p. m. a partir del 21 de agosto de 2026, con siete sesiones (21 de agosto; 4 y 18 de septiembre; 2, 16 y 30 de octubre; 20 de noviembre). La modalidad de cada sesión —presencial o sincrónica— corresponde a la fijada por el calendario para ese fin de semana: presencial el 21 de agosto, 18 de septiembre, 16 de octubre y 20 de noviembre; sincrónica (asistida por tecnología) el 4 de septiembre, 2 y 30 de octubre. El encuentro del 13 de noviembre es de sustentaciones de tesis II y no corresponde a este espacio académico. Las 48 horas presenciales declaradas en el contenido programático corresponden a 21 horas de encuentro efectivas (7 × 3 h); se registran las declaradas por coherencia con el contenido programático aprobado. Evaluación por productos de corte: primer corte 35 %, segundo corte 35 %, producto final 30 %.</w:t>
       </w:r>
     </w:p>
     <w:sectPr>

</xml_diff>